<commit_message>
Add funding opportunities section to pitch document
Includes UNICEF Venture Fund, IGNITE, Punjab IT Board, EU grants,
UNDP, strategic partnerships, and 8-step action plan with timelines.

Co-Authored-By: Claude Opus 4.6 <noreply@anthropic.com>
Claude-Session: https://claude.ai/code/session_01SpVHb4wYBcqMn4yr5tsTKr
</commit_message>
<xml_diff>
--- a/OrphanGuard_AI_Pitch_Document.docx
+++ b/OrphanGuard_AI_Pitch_Document.docx
@@ -3740,6 +3740,1279 @@
           <w:color w:val="10B981"/>
           <w:sz w:val="44"/>
         </w:rPr>
+        <w:t>Funding &amp; Grant Opportunities</w:t>
+      </w:r>
+    </w:p>
+    <w:p>
+      <w:pPr>
+        <w:spacing w:after="240"/>
+      </w:pPr>
+      <w:r>
+        <w:rPr>
+          <w:color w:val="10B981"/>
+          <w:sz w:val="8"/>
+        </w:rPr>
+        <w:t>____________________________________________________________</w:t>
+      </w:r>
+    </w:p>
+    <w:p>
+      <w:pPr>
+        <w:spacing w:after="160"/>
+      </w:pPr>
+      <w:r>
+        <w:rPr>
+          <w:color w:val="333333"/>
+          <w:sz w:val="22"/>
+        </w:rPr>
+        <w:t>OrphanGuard AI sits at the intersection of AI, child protection, and social impact — a space where multiple international and domestic funders are actively deploying capital. The following opportunities are directly aligned with this project.</w:t>
+      </w:r>
+    </w:p>
+    <w:p>
+      <w:pPr>
+        <w:spacing w:before="320" w:after="160"/>
+      </w:pPr>
+      <w:r>
+        <w:rPr>
+          <w:b/>
+          <w:color w:val="0A7A56"/>
+          <w:sz w:val="30"/>
+        </w:rPr>
+        <w:t>Tier 1 — High-Priority International Grants</w:t>
+      </w:r>
+    </w:p>
+    <w:tbl>
+      <w:tblPr>
+        <w:tblW w:type="auto" w:w="0"/>
+        <w:jc w:val="center"/>
+        <w:tblLook w:firstColumn="1" w:firstRow="1" w:lastColumn="0" w:lastRow="0" w:noHBand="0" w:noVBand="1" w:val="04A0"/>
+        <w:tblBorders>
+          <w:top w:val="single" w:sz="4" w:space="0" w:color="D1D5DB"/>
+          <w:left w:val="single" w:sz="4" w:space="0" w:color="D1D5DB"/>
+          <w:bottom w:val="single" w:sz="4" w:space="0" w:color="D1D5DB"/>
+          <w:right w:val="single" w:sz="4" w:space="0" w:color="D1D5DB"/>
+          <w:insideH w:val="single" w:sz="4" w:space="0" w:color="D1D5DB"/>
+          <w:insideV w:val="single" w:sz="4" w:space="0" w:color="D1D5DB"/>
+        </w:tblBorders>
+      </w:tblPr>
+      <w:tblGrid>
+        <w:gridCol w:w="2351"/>
+        <w:gridCol w:w="2351"/>
+        <w:gridCol w:w="2351"/>
+        <w:gridCol w:w="2351"/>
+      </w:tblGrid>
+      <w:tr>
+        <w:tc>
+          <w:tcPr>
+            <w:tcW w:type="dxa" w:w="2351"/>
+            <w:shd w:fill="10B981"/>
+          </w:tcPr>
+          <w:p>
+            <w:r/>
+            <w:r>
+              <w:rPr>
+                <w:b/>
+                <w:color w:val="FFFFFF"/>
+                <w:sz w:val="20"/>
+              </w:rPr>
+              <w:t>Funder</w:t>
+            </w:r>
+          </w:p>
+        </w:tc>
+        <w:tc>
+          <w:tcPr>
+            <w:tcW w:type="dxa" w:w="2351"/>
+            <w:shd w:fill="10B981"/>
+          </w:tcPr>
+          <w:p>
+            <w:r/>
+            <w:r>
+              <w:rPr>
+                <w:b/>
+                <w:color w:val="FFFFFF"/>
+                <w:sz w:val="20"/>
+              </w:rPr>
+              <w:t>Amount</w:t>
+            </w:r>
+          </w:p>
+        </w:tc>
+        <w:tc>
+          <w:tcPr>
+            <w:tcW w:type="dxa" w:w="2351"/>
+            <w:shd w:fill="10B981"/>
+          </w:tcPr>
+          <w:p>
+            <w:r/>
+            <w:r>
+              <w:rPr>
+                <w:b/>
+                <w:color w:val="FFFFFF"/>
+                <w:sz w:val="20"/>
+              </w:rPr>
+              <w:t>Fit for OrphanGuard</w:t>
+            </w:r>
+          </w:p>
+        </w:tc>
+        <w:tc>
+          <w:tcPr>
+            <w:tcW w:type="dxa" w:w="2351"/>
+            <w:shd w:fill="10B981"/>
+          </w:tcPr>
+          <w:p>
+            <w:r/>
+            <w:r>
+              <w:rPr>
+                <w:b/>
+                <w:color w:val="FFFFFF"/>
+                <w:sz w:val="20"/>
+              </w:rPr>
+              <w:t>Status</w:t>
+            </w:r>
+          </w:p>
+        </w:tc>
+      </w:tr>
+      <w:tr>
+        <w:tc>
+          <w:tcPr>
+            <w:tcW w:type="dxa" w:w="2351"/>
+          </w:tcPr>
+          <w:p>
+            <w:r/>
+            <w:r>
+              <w:rPr>
+                <w:color w:val="1A1A1A"/>
+                <w:sz w:val="20"/>
+              </w:rPr>
+              <w:t>UNICEF Venture Fund</w:t>
+            </w:r>
+          </w:p>
+        </w:tc>
+        <w:tc>
+          <w:tcPr>
+            <w:tcW w:type="dxa" w:w="2351"/>
+          </w:tcPr>
+          <w:p>
+            <w:r/>
+            <w:r>
+              <w:rPr>
+                <w:color w:val="1A1A1A"/>
+                <w:sz w:val="20"/>
+              </w:rPr>
+              <w:t>Up to $100,000 (equity-free)</w:t>
+            </w:r>
+          </w:p>
+        </w:tc>
+        <w:tc>
+          <w:tcPr>
+            <w:tcW w:type="dxa" w:w="2351"/>
+          </w:tcPr>
+          <w:p>
+            <w:r/>
+            <w:r>
+              <w:rPr>
+                <w:color w:val="1A1A1A"/>
+                <w:sz w:val="20"/>
+              </w:rPr>
+              <w:t>AI + children + Pakistan (programme country). They've funded child safety tech cohorts before. Need: registered company, working prototype, open-source commitment.</w:t>
+            </w:r>
+          </w:p>
+        </w:tc>
+        <w:tc>
+          <w:tcPr>
+            <w:tcW w:type="dxa" w:w="2351"/>
+          </w:tcPr>
+          <w:p>
+            <w:r/>
+            <w:r>
+              <w:rPr>
+                <w:color w:val="1A1A1A"/>
+                <w:sz w:val="20"/>
+              </w:rPr>
+              <w:t>Watch for next call — unicefventurefund.org</w:t>
+            </w:r>
+          </w:p>
+        </w:tc>
+      </w:tr>
+      <w:tr>
+        <w:tc>
+          <w:tcPr>
+            <w:tcW w:type="dxa" w:w="2351"/>
+            <w:shd w:fill="F0FDF4"/>
+          </w:tcPr>
+          <w:p>
+            <w:r/>
+            <w:r>
+              <w:rPr>
+                <w:color w:val="1A1A1A"/>
+                <w:sz w:val="20"/>
+              </w:rPr>
+              <w:t>EU — Integrated Child Protection Systems</w:t>
+            </w:r>
+          </w:p>
+        </w:tc>
+        <w:tc>
+          <w:tcPr>
+            <w:tcW w:type="dxa" w:w="2351"/>
+            <w:shd w:fill="F0FDF4"/>
+          </w:tcPr>
+          <w:p>
+            <w:r/>
+            <w:r>
+              <w:rPr>
+                <w:color w:val="1A1A1A"/>
+                <w:sz w:val="20"/>
+              </w:rPr>
+              <w:t>Varies (large grants)</w:t>
+            </w:r>
+          </w:p>
+        </w:tc>
+        <w:tc>
+          <w:tcPr>
+            <w:tcW w:type="dxa" w:w="2351"/>
+            <w:shd w:fill="F0FDF4"/>
+          </w:tcPr>
+          <w:p>
+            <w:r/>
+            <w:r>
+              <w:rPr>
+                <w:color w:val="1A1A1A"/>
+                <w:sz w:val="20"/>
+              </w:rPr>
+              <w:t>Strengthening child protection systems and violence prevention. May need EU-based lead partner.</w:t>
+            </w:r>
+          </w:p>
+        </w:tc>
+        <w:tc>
+          <w:tcPr>
+            <w:tcW w:type="dxa" w:w="2351"/>
+            <w:shd w:fill="F0FDF4"/>
+          </w:tcPr>
+          <w:p>
+            <w:r/>
+            <w:r>
+              <w:rPr>
+                <w:color w:val="1A1A1A"/>
+                <w:sz w:val="20"/>
+              </w:rPr>
+              <w:t>Deadline: 3 November 2026</w:t>
+            </w:r>
+          </w:p>
+        </w:tc>
+      </w:tr>
+      <w:tr>
+        <w:tc>
+          <w:tcPr>
+            <w:tcW w:type="dxa" w:w="2351"/>
+          </w:tcPr>
+          <w:p>
+            <w:r/>
+            <w:r>
+              <w:rPr>
+                <w:color w:val="1A1A1A"/>
+                <w:sz w:val="20"/>
+              </w:rPr>
+              <w:t>Childhood Foundation</w:t>
+            </w:r>
+          </w:p>
+        </w:tc>
+        <w:tc>
+          <w:tcPr>
+            <w:tcW w:type="dxa" w:w="2351"/>
+          </w:tcPr>
+          <w:p>
+            <w:r/>
+            <w:r>
+              <w:rPr>
+                <w:color w:val="1A1A1A"/>
+                <w:sz w:val="20"/>
+              </w:rPr>
+              <w:t>Varies</w:t>
+            </w:r>
+          </w:p>
+        </w:tc>
+        <w:tc>
+          <w:tcPr>
+            <w:tcW w:type="dxa" w:w="2351"/>
+          </w:tcPr>
+          <w:p>
+            <w:r/>
+            <w:r>
+              <w:rPr>
+                <w:color w:val="1A1A1A"/>
+                <w:sz w:val="20"/>
+              </w:rPr>
+              <w:t>Grants to end child sexual abuse and exploitation. Check Pakistan eligibility.</w:t>
+            </w:r>
+          </w:p>
+        </w:tc>
+        <w:tc>
+          <w:tcPr>
+            <w:tcW w:type="dxa" w:w="2351"/>
+          </w:tcPr>
+          <w:p>
+            <w:r/>
+            <w:r>
+              <w:rPr>
+                <w:color w:val="1A1A1A"/>
+                <w:sz w:val="20"/>
+              </w:rPr>
+              <w:t>Deadline: 31 December 2026</w:t>
+            </w:r>
+          </w:p>
+        </w:tc>
+      </w:tr>
+      <w:tr>
+        <w:tc>
+          <w:tcPr>
+            <w:tcW w:type="dxa" w:w="2351"/>
+            <w:shd w:fill="F0FDF4"/>
+          </w:tcPr>
+          <w:p>
+            <w:r/>
+            <w:r>
+              <w:rPr>
+                <w:color w:val="1A1A1A"/>
+                <w:sz w:val="20"/>
+              </w:rPr>
+              <w:t>UNDP Innovation Challenge — Pakistan</w:t>
+            </w:r>
+          </w:p>
+        </w:tc>
+        <w:tc>
+          <w:tcPr>
+            <w:tcW w:type="dxa" w:w="2351"/>
+            <w:shd w:fill="F0FDF4"/>
+          </w:tcPr>
+          <w:p>
+            <w:r/>
+            <w:r>
+              <w:rPr>
+                <w:color w:val="1A1A1A"/>
+                <w:sz w:val="20"/>
+              </w:rPr>
+              <w:t>Up to $30,000</w:t>
+            </w:r>
+          </w:p>
+        </w:tc>
+        <w:tc>
+          <w:tcPr>
+            <w:tcW w:type="dxa" w:w="2351"/>
+            <w:shd w:fill="F0FDF4"/>
+          </w:tcPr>
+          <w:p>
+            <w:r/>
+            <w:r>
+              <w:rPr>
+                <w:color w:val="1A1A1A"/>
+                <w:sz w:val="20"/>
+              </w:rPr>
+              <w:t>Scalable social innovations. Digital inclusion and youth empowerment themes.</w:t>
+            </w:r>
+          </w:p>
+        </w:tc>
+        <w:tc>
+          <w:tcPr>
+            <w:tcW w:type="dxa" w:w="2351"/>
+            <w:shd w:fill="F0FDF4"/>
+          </w:tcPr>
+          <w:p>
+            <w:r/>
+            <w:r>
+              <w:rPr>
+                <w:color w:val="1A1A1A"/>
+                <w:sz w:val="20"/>
+              </w:rPr>
+              <w:t>Confirm if active</w:t>
+            </w:r>
+          </w:p>
+        </w:tc>
+      </w:tr>
+    </w:tbl>
+    <w:p/>
+    <w:p>
+      <w:pPr>
+        <w:spacing w:before="320" w:after="160"/>
+      </w:pPr>
+      <w:r>
+        <w:rPr>
+          <w:b/>
+          <w:color w:val="0A7A56"/>
+          <w:sz w:val="30"/>
+        </w:rPr>
+        <w:t>Tier 2 — Pakistan Government &amp; Ecosystem Funding</w:t>
+      </w:r>
+    </w:p>
+    <w:tbl>
+      <w:tblPr>
+        <w:tblW w:type="auto" w:w="0"/>
+        <w:jc w:val="center"/>
+        <w:tblLook w:firstColumn="1" w:firstRow="1" w:lastColumn="0" w:lastRow="0" w:noHBand="0" w:noVBand="1" w:val="04A0"/>
+        <w:tblBorders>
+          <w:top w:val="single" w:sz="4" w:space="0" w:color="D1D5DB"/>
+          <w:left w:val="single" w:sz="4" w:space="0" w:color="D1D5DB"/>
+          <w:bottom w:val="single" w:sz="4" w:space="0" w:color="D1D5DB"/>
+          <w:right w:val="single" w:sz="4" w:space="0" w:color="D1D5DB"/>
+          <w:insideH w:val="single" w:sz="4" w:space="0" w:color="D1D5DB"/>
+          <w:insideV w:val="single" w:sz="4" w:space="0" w:color="D1D5DB"/>
+        </w:tblBorders>
+      </w:tblPr>
+      <w:tblGrid>
+        <w:gridCol w:w="3135"/>
+        <w:gridCol w:w="3135"/>
+        <w:gridCol w:w="3135"/>
+      </w:tblGrid>
+      <w:tr>
+        <w:tc>
+          <w:tcPr>
+            <w:tcW w:type="dxa" w:w="3135"/>
+            <w:shd w:fill="10B981"/>
+          </w:tcPr>
+          <w:p>
+            <w:r/>
+            <w:r>
+              <w:rPr>
+                <w:b/>
+                <w:color w:val="FFFFFF"/>
+                <w:sz w:val="20"/>
+              </w:rPr>
+              <w:t>Funder</w:t>
+            </w:r>
+          </w:p>
+        </w:tc>
+        <w:tc>
+          <w:tcPr>
+            <w:tcW w:type="dxa" w:w="3135"/>
+            <w:shd w:fill="10B981"/>
+          </w:tcPr>
+          <w:p>
+            <w:r/>
+            <w:r>
+              <w:rPr>
+                <w:b/>
+                <w:color w:val="FFFFFF"/>
+                <w:sz w:val="20"/>
+              </w:rPr>
+              <w:t>Amount</w:t>
+            </w:r>
+          </w:p>
+        </w:tc>
+        <w:tc>
+          <w:tcPr>
+            <w:tcW w:type="dxa" w:w="3135"/>
+            <w:shd w:fill="10B981"/>
+          </w:tcPr>
+          <w:p>
+            <w:r/>
+            <w:r>
+              <w:rPr>
+                <w:b/>
+                <w:color w:val="FFFFFF"/>
+                <w:sz w:val="20"/>
+              </w:rPr>
+              <w:t>Details</w:t>
+            </w:r>
+          </w:p>
+        </w:tc>
+      </w:tr>
+      <w:tr>
+        <w:tc>
+          <w:tcPr>
+            <w:tcW w:type="dxa" w:w="3135"/>
+          </w:tcPr>
+          <w:p>
+            <w:r/>
+            <w:r>
+              <w:rPr>
+                <w:color w:val="1A1A1A"/>
+                <w:sz w:val="20"/>
+              </w:rPr>
+              <w:t>IGNITE National Technology Fund</w:t>
+            </w:r>
+          </w:p>
+        </w:tc>
+        <w:tc>
+          <w:tcPr>
+            <w:tcW w:type="dxa" w:w="3135"/>
+          </w:tcPr>
+          <w:p>
+            <w:r/>
+            <w:r>
+              <w:rPr>
+                <w:color w:val="1A1A1A"/>
+                <w:sz w:val="20"/>
+              </w:rPr>
+              <w:t>PKR 10–50 Million</w:t>
+            </w:r>
+          </w:p>
+        </w:tc>
+        <w:tc>
+          <w:tcPr>
+            <w:tcW w:type="dxa" w:w="3135"/>
+          </w:tcPr>
+          <w:p>
+            <w:r/>
+            <w:r>
+              <w:rPr>
+                <w:color w:val="1A1A1A"/>
+                <w:sz w:val="20"/>
+              </w:rPr>
+              <w:t>Government fund for social impact tech. Apply through National Incubation Centers (Lahore, Islamabad, Peshawar, etc.)</w:t>
+            </w:r>
+          </w:p>
+        </w:tc>
+      </w:tr>
+      <w:tr>
+        <w:tc>
+          <w:tcPr>
+            <w:tcW w:type="dxa" w:w="3135"/>
+            <w:shd w:fill="F0FDF4"/>
+          </w:tcPr>
+          <w:p>
+            <w:r/>
+            <w:r>
+              <w:rPr>
+                <w:color w:val="1A1A1A"/>
+                <w:sz w:val="20"/>
+              </w:rPr>
+              <w:t>Punjab IT Board / Plan9</w:t>
+            </w:r>
+          </w:p>
+        </w:tc>
+        <w:tc>
+          <w:tcPr>
+            <w:tcW w:type="dxa" w:w="3135"/>
+            <w:shd w:fill="F0FDF4"/>
+          </w:tcPr>
+          <w:p>
+            <w:r/>
+            <w:r>
+              <w:rPr>
+                <w:color w:val="1A1A1A"/>
+                <w:sz w:val="20"/>
+              </w:rPr>
+              <w:t>Up to PKR 1.5 Million + workspace</w:t>
+            </w:r>
+          </w:p>
+        </w:tc>
+        <w:tc>
+          <w:tcPr>
+            <w:tcW w:type="dxa" w:w="3135"/>
+            <w:shd w:fill="F0FDF4"/>
+          </w:tcPr>
+          <w:p>
+            <w:r/>
+            <w:r>
+              <w:rPr>
+                <w:color w:val="1A1A1A"/>
+                <w:sz w:val="20"/>
+              </w:rPr>
+              <w:t>Punjab-specific. Incubation at Punjab Innovation Park, Lahore. Mentorship included.</w:t>
+            </w:r>
+          </w:p>
+        </w:tc>
+      </w:tr>
+      <w:tr>
+        <w:tc>
+          <w:tcPr>
+            <w:tcW w:type="dxa" w:w="3135"/>
+          </w:tcPr>
+          <w:p>
+            <w:r/>
+            <w:r>
+              <w:rPr>
+                <w:color w:val="1A1A1A"/>
+                <w:sz w:val="20"/>
+              </w:rPr>
+              <w:t>Pakistan Startup Fund</w:t>
+            </w:r>
+          </w:p>
+        </w:tc>
+        <w:tc>
+          <w:tcPr>
+            <w:tcW w:type="dxa" w:w="3135"/>
+          </w:tcPr>
+          <w:p>
+            <w:r/>
+            <w:r>
+              <w:rPr>
+                <w:color w:val="1A1A1A"/>
+                <w:sz w:val="20"/>
+              </w:rPr>
+              <w:t>Up to $300,000</w:t>
+            </w:r>
+          </w:p>
+        </w:tc>
+        <w:tc>
+          <w:tcPr>
+            <w:tcW w:type="dxa" w:w="3135"/>
+          </w:tcPr>
+          <w:p>
+            <w:r/>
+            <w:r>
+              <w:rPr>
+                <w:color w:val="1A1A1A"/>
+                <w:sz w:val="20"/>
+              </w:rPr>
+              <w:t>Non-dilutive grants per VC investment round for Pakistani startups with traction.</w:t>
+            </w:r>
+          </w:p>
+        </w:tc>
+      </w:tr>
+      <w:tr>
+        <w:tc>
+          <w:tcPr>
+            <w:tcW w:type="dxa" w:w="3135"/>
+            <w:shd w:fill="F0FDF4"/>
+          </w:tcPr>
+          <w:p>
+            <w:r/>
+            <w:r>
+              <w:rPr>
+                <w:color w:val="1A1A1A"/>
+                <w:sz w:val="20"/>
+              </w:rPr>
+              <w:t>Punjab Youth Innovation Competition</w:t>
+            </w:r>
+          </w:p>
+        </w:tc>
+        <w:tc>
+          <w:tcPr>
+            <w:tcW w:type="dxa" w:w="3135"/>
+            <w:shd w:fill="F0FDF4"/>
+          </w:tcPr>
+          <w:p>
+            <w:r/>
+            <w:r>
+              <w:rPr>
+                <w:color w:val="1A1A1A"/>
+                <w:sz w:val="20"/>
+              </w:rPr>
+              <w:t>PKR 1M + $10,000 USD</w:t>
+            </w:r>
+          </w:p>
+        </w:tc>
+        <w:tc>
+          <w:tcPr>
+            <w:tcW w:type="dxa" w:w="3135"/>
+            <w:shd w:fill="F0FDF4"/>
+          </w:tcPr>
+          <w:p>
+            <w:r/>
+            <w:r>
+              <w:rPr>
+                <w:color w:val="1A1A1A"/>
+                <w:sz w:val="20"/>
+              </w:rPr>
+              <w:t>Through Lahore College for Women University incubation center. Watch for next cycle.</w:t>
+            </w:r>
+          </w:p>
+        </w:tc>
+      </w:tr>
+    </w:tbl>
+    <w:p/>
+    <w:p>
+      <w:pPr>
+        <w:spacing w:before="320" w:after="160"/>
+      </w:pPr>
+      <w:r>
+        <w:rPr>
+          <w:b/>
+          <w:color w:val="0A7A56"/>
+          <w:sz w:val="30"/>
+        </w:rPr>
+        <w:t>Tier 3 — Strategic Partnerships</w:t>
+      </w:r>
+    </w:p>
+    <w:p>
+      <w:pPr>
+        <w:spacing w:after="160"/>
+      </w:pPr>
+      <w:r>
+        <w:rPr>
+          <w:color w:val="333333"/>
+          <w:sz w:val="22"/>
+        </w:rPr>
+        <w:t>Beyond grants, OrphanGuard AI can pursue revenue through institutional partnerships:</w:t>
+      </w:r>
+    </w:p>
+    <w:p>
+      <w:pPr>
+        <w:pStyle w:val="ListBullet"/>
+      </w:pPr>
+      <w:r>
+        <w:rPr>
+          <w:b/>
+          <w:sz w:val="22"/>
+        </w:rPr>
+        <w:t xml:space="preserve">Punjab Social Welfare Department — </w:t>
+      </w:r>
+      <w:r>
+        <w:t>Directly supports their mandate and existing spend (Rs 645.89M on Sweet Homes alone)</w:t>
+      </w:r>
+    </w:p>
+    <w:p>
+      <w:pPr>
+        <w:pStyle w:val="ListBullet"/>
+      </w:pPr>
+      <w:r>
+        <w:rPr>
+          <w:b/>
+          <w:sz w:val="22"/>
+        </w:rPr>
+        <w:t xml:space="preserve">UNICEF Pakistan — </w:t>
+      </w:r>
+      <w:r>
+        <w:t>72% funding gap in Pakistan child protection; our system fills exactly what they need</w:t>
+      </w:r>
+    </w:p>
+    <w:p>
+      <w:pPr>
+        <w:pStyle w:val="ListBullet"/>
+      </w:pPr>
+      <w:r>
+        <w:rPr>
+          <w:b/>
+          <w:sz w:val="22"/>
+        </w:rPr>
+        <w:t xml:space="preserve">Edhi Foundation / Al-Khidmat / SOS Villages — </w:t>
+      </w:r>
+      <w:r>
+        <w:t>Largest orphanage networks in Punjab; natural pilot partners and co-funders</w:t>
+      </w:r>
+    </w:p>
+    <w:p>
+      <w:pPr>
+        <w:pStyle w:val="ListBullet"/>
+      </w:pPr>
+      <w:r>
+        <w:rPr>
+          <w:b/>
+          <w:sz w:val="22"/>
+        </w:rPr>
+        <w:t xml:space="preserve">Child Protection Bureau — </w:t>
+      </w:r>
+      <w:r>
+        <w:t>Their ZARRA app (2023) shows appetite for tech; OrphanGuard AI is the next step</w:t>
+      </w:r>
+    </w:p>
+    <w:p>
+      <w:pPr>
+        <w:pStyle w:val="ListBullet"/>
+      </w:pPr>
+      <w:r>
+        <w:rPr>
+          <w:b/>
+          <w:sz w:val="22"/>
+        </w:rPr>
+        <w:t xml:space="preserve">UN Committee on Rights of the Child — </w:t>
+      </w:r>
+      <w:r>
+        <w:t>January 2026 review pressured Pakistan on child monitoring; our data serves their reporting</w:t>
+      </w:r>
+    </w:p>
+    <w:p/>
+    <w:p>
+      <w:pPr>
+        <w:spacing w:before="320" w:after="160"/>
+      </w:pPr>
+      <w:r>
+        <w:rPr>
+          <w:b/>
+          <w:color w:val="0A7A56"/>
+          <w:sz w:val="30"/>
+        </w:rPr>
+        <w:t>Recommended Action Plan</w:t>
+      </w:r>
+    </w:p>
+    <w:tbl>
+      <w:tblPr>
+        <w:tblW w:type="auto" w:w="0"/>
+        <w:jc w:val="center"/>
+        <w:tblLook w:firstColumn="1" w:firstRow="1" w:lastColumn="0" w:lastRow="0" w:noHBand="0" w:noVBand="1" w:val="04A0"/>
+        <w:tblBorders>
+          <w:top w:val="single" w:sz="4" w:space="0" w:color="D1D5DB"/>
+          <w:left w:val="single" w:sz="4" w:space="0" w:color="D1D5DB"/>
+          <w:bottom w:val="single" w:sz="4" w:space="0" w:color="D1D5DB"/>
+          <w:right w:val="single" w:sz="4" w:space="0" w:color="D1D5DB"/>
+          <w:insideH w:val="single" w:sz="4" w:space="0" w:color="D1D5DB"/>
+          <w:insideV w:val="single" w:sz="4" w:space="0" w:color="D1D5DB"/>
+        </w:tblBorders>
+      </w:tblPr>
+      <w:tblGrid>
+        <w:gridCol w:w="3135"/>
+        <w:gridCol w:w="3135"/>
+        <w:gridCol w:w="3135"/>
+      </w:tblGrid>
+      <w:tr>
+        <w:tc>
+          <w:tcPr>
+            <w:tcW w:type="dxa" w:w="3135"/>
+            <w:shd w:fill="10B981"/>
+          </w:tcPr>
+          <w:p>
+            <w:r/>
+            <w:r>
+              <w:rPr>
+                <w:b/>
+                <w:color w:val="FFFFFF"/>
+                <w:sz w:val="20"/>
+              </w:rPr>
+              <w:t>Priority</w:t>
+            </w:r>
+          </w:p>
+        </w:tc>
+        <w:tc>
+          <w:tcPr>
+            <w:tcW w:type="dxa" w:w="3135"/>
+            <w:shd w:fill="10B981"/>
+          </w:tcPr>
+          <w:p>
+            <w:r/>
+            <w:r>
+              <w:rPr>
+                <w:b/>
+                <w:color w:val="FFFFFF"/>
+                <w:sz w:val="20"/>
+              </w:rPr>
+              <w:t>Action</w:t>
+            </w:r>
+          </w:p>
+        </w:tc>
+        <w:tc>
+          <w:tcPr>
+            <w:tcW w:type="dxa" w:w="3135"/>
+            <w:shd w:fill="10B981"/>
+          </w:tcPr>
+          <w:p>
+            <w:r/>
+            <w:r>
+              <w:rPr>
+                <w:b/>
+                <w:color w:val="FFFFFF"/>
+                <w:sz w:val="20"/>
+              </w:rPr>
+              <w:t>Timeline</w:t>
+            </w:r>
+          </w:p>
+        </w:tc>
+      </w:tr>
+      <w:tr>
+        <w:tc>
+          <w:tcPr>
+            <w:tcW w:type="dxa" w:w="3135"/>
+          </w:tcPr>
+          <w:p>
+            <w:r/>
+            <w:r>
+              <w:rPr>
+                <w:color w:val="1A1A1A"/>
+                <w:sz w:val="20"/>
+              </w:rPr>
+              <w:t>1</w:t>
+            </w:r>
+          </w:p>
+        </w:tc>
+        <w:tc>
+          <w:tcPr>
+            <w:tcW w:type="dxa" w:w="3135"/>
+          </w:tcPr>
+          <w:p>
+            <w:r/>
+            <w:r>
+              <w:rPr>
+                <w:color w:val="1A1A1A"/>
+                <w:sz w:val="20"/>
+              </w:rPr>
+              <w:t>Register as private for-profit company in Pakistan (required for UNICEF Venture Fund)</w:t>
+            </w:r>
+          </w:p>
+        </w:tc>
+        <w:tc>
+          <w:tcPr>
+            <w:tcW w:type="dxa" w:w="3135"/>
+          </w:tcPr>
+          <w:p>
+            <w:r/>
+            <w:r>
+              <w:rPr>
+                <w:color w:val="1A1A1A"/>
+                <w:sz w:val="20"/>
+              </w:rPr>
+              <w:t>Immediately</w:t>
+            </w:r>
+          </w:p>
+        </w:tc>
+      </w:tr>
+      <w:tr>
+        <w:tc>
+          <w:tcPr>
+            <w:tcW w:type="dxa" w:w="3135"/>
+            <w:shd w:fill="F0FDF4"/>
+          </w:tcPr>
+          <w:p>
+            <w:r/>
+            <w:r>
+              <w:rPr>
+                <w:color w:val="1A1A1A"/>
+                <w:sz w:val="20"/>
+              </w:rPr>
+              <w:t>2</w:t>
+            </w:r>
+          </w:p>
+        </w:tc>
+        <w:tc>
+          <w:tcPr>
+            <w:tcW w:type="dxa" w:w="3135"/>
+            <w:shd w:fill="F0FDF4"/>
+          </w:tcPr>
+          <w:p>
+            <w:r/>
+            <w:r>
+              <w:rPr>
+                <w:color w:val="1A1A1A"/>
+                <w:sz w:val="20"/>
+              </w:rPr>
+              <w:t>Apply to IGNITE through National Incubation Center Lahore</w:t>
+            </w:r>
+          </w:p>
+        </w:tc>
+        <w:tc>
+          <w:tcPr>
+            <w:tcW w:type="dxa" w:w="3135"/>
+            <w:shd w:fill="F0FDF4"/>
+          </w:tcPr>
+          <w:p>
+            <w:r/>
+            <w:r>
+              <w:rPr>
+                <w:color w:val="1A1A1A"/>
+                <w:sz w:val="20"/>
+              </w:rPr>
+              <w:t>Within 2 weeks</w:t>
+            </w:r>
+          </w:p>
+        </w:tc>
+      </w:tr>
+      <w:tr>
+        <w:tc>
+          <w:tcPr>
+            <w:tcW w:type="dxa" w:w="3135"/>
+          </w:tcPr>
+          <w:p>
+            <w:r/>
+            <w:r>
+              <w:rPr>
+                <w:color w:val="1A1A1A"/>
+                <w:sz w:val="20"/>
+              </w:rPr>
+              <w:t>3</w:t>
+            </w:r>
+          </w:p>
+        </w:tc>
+        <w:tc>
+          <w:tcPr>
+            <w:tcW w:type="dxa" w:w="3135"/>
+          </w:tcPr>
+          <w:p>
+            <w:r/>
+            <w:r>
+              <w:rPr>
+                <w:color w:val="1A1A1A"/>
+                <w:sz w:val="20"/>
+              </w:rPr>
+              <w:t>Submit for EU Child Protection Systems grant (Nov 3 deadline) — find EU-based lead partner</w:t>
+            </w:r>
+          </w:p>
+        </w:tc>
+        <w:tc>
+          <w:tcPr>
+            <w:tcW w:type="dxa" w:w="3135"/>
+          </w:tcPr>
+          <w:p>
+            <w:r/>
+            <w:r>
+              <w:rPr>
+                <w:color w:val="1A1A1A"/>
+                <w:sz w:val="20"/>
+              </w:rPr>
+              <w:t>Before November 2026</w:t>
+            </w:r>
+          </w:p>
+        </w:tc>
+      </w:tr>
+      <w:tr>
+        <w:tc>
+          <w:tcPr>
+            <w:tcW w:type="dxa" w:w="3135"/>
+            <w:shd w:fill="F0FDF4"/>
+          </w:tcPr>
+          <w:p>
+            <w:r/>
+            <w:r>
+              <w:rPr>
+                <w:color w:val="1A1A1A"/>
+                <w:sz w:val="20"/>
+              </w:rPr>
+              <w:t>4</w:t>
+            </w:r>
+          </w:p>
+        </w:tc>
+        <w:tc>
+          <w:tcPr>
+            <w:tcW w:type="dxa" w:w="3135"/>
+            <w:shd w:fill="F0FDF4"/>
+          </w:tcPr>
+          <w:p>
+            <w:r/>
+            <w:r>
+              <w:rPr>
+                <w:color w:val="1A1A1A"/>
+                <w:sz w:val="20"/>
+              </w:rPr>
+              <w:t>Contact UNICEF Pakistan Child Protection section directly with pitch + live demo</w:t>
+            </w:r>
+          </w:p>
+        </w:tc>
+        <w:tc>
+          <w:tcPr>
+            <w:tcW w:type="dxa" w:w="3135"/>
+            <w:shd w:fill="F0FDF4"/>
+          </w:tcPr>
+          <w:p>
+            <w:r/>
+            <w:r>
+              <w:rPr>
+                <w:color w:val="1A1A1A"/>
+                <w:sz w:val="20"/>
+              </w:rPr>
+              <w:t>Within 1 month</w:t>
+            </w:r>
+          </w:p>
+        </w:tc>
+      </w:tr>
+      <w:tr>
+        <w:tc>
+          <w:tcPr>
+            <w:tcW w:type="dxa" w:w="3135"/>
+          </w:tcPr>
+          <w:p>
+            <w:r/>
+            <w:r>
+              <w:rPr>
+                <w:color w:val="1A1A1A"/>
+                <w:sz w:val="20"/>
+              </w:rPr>
+              <w:t>5</w:t>
+            </w:r>
+          </w:p>
+        </w:tc>
+        <w:tc>
+          <w:tcPr>
+            <w:tcW w:type="dxa" w:w="3135"/>
+          </w:tcPr>
+          <w:p>
+            <w:r/>
+            <w:r>
+              <w:rPr>
+                <w:color w:val="1A1A1A"/>
+                <w:sz w:val="20"/>
+              </w:rPr>
+              <w:t>Monitor UNICEF Venture Fund for next open call — prepare application in advance</w:t>
+            </w:r>
+          </w:p>
+        </w:tc>
+        <w:tc>
+          <w:tcPr>
+            <w:tcW w:type="dxa" w:w="3135"/>
+          </w:tcPr>
+          <w:p>
+            <w:r/>
+            <w:r>
+              <w:rPr>
+                <w:color w:val="1A1A1A"/>
+                <w:sz w:val="20"/>
+              </w:rPr>
+              <w:t>Ongoing</w:t>
+            </w:r>
+          </w:p>
+        </w:tc>
+      </w:tr>
+      <w:tr>
+        <w:tc>
+          <w:tcPr>
+            <w:tcW w:type="dxa" w:w="3135"/>
+            <w:shd w:fill="F0FDF4"/>
+          </w:tcPr>
+          <w:p>
+            <w:r/>
+            <w:r>
+              <w:rPr>
+                <w:color w:val="1A1A1A"/>
+                <w:sz w:val="20"/>
+              </w:rPr>
+              <w:t>6</w:t>
+            </w:r>
+          </w:p>
+        </w:tc>
+        <w:tc>
+          <w:tcPr>
+            <w:tcW w:type="dxa" w:w="3135"/>
+            <w:shd w:fill="F0FDF4"/>
+          </w:tcPr>
+          <w:p>
+            <w:r/>
+            <w:r>
+              <w:rPr>
+                <w:color w:val="1A1A1A"/>
+                <w:sz w:val="20"/>
+              </w:rPr>
+              <w:t>Approach Punjab Social Welfare Department for pilot partnership (3–5 orphanages)</w:t>
+            </w:r>
+          </w:p>
+        </w:tc>
+        <w:tc>
+          <w:tcPr>
+            <w:tcW w:type="dxa" w:w="3135"/>
+            <w:shd w:fill="F0FDF4"/>
+          </w:tcPr>
+          <w:p>
+            <w:r/>
+            <w:r>
+              <w:rPr>
+                <w:color w:val="1A1A1A"/>
+                <w:sz w:val="20"/>
+              </w:rPr>
+              <w:t>Within 2 months</w:t>
+            </w:r>
+          </w:p>
+        </w:tc>
+      </w:tr>
+      <w:tr>
+        <w:tc>
+          <w:tcPr>
+            <w:tcW w:type="dxa" w:w="3135"/>
+          </w:tcPr>
+          <w:p>
+            <w:r/>
+            <w:r>
+              <w:rPr>
+                <w:color w:val="1A1A1A"/>
+                <w:sz w:val="20"/>
+              </w:rPr>
+              <w:t>7</w:t>
+            </w:r>
+          </w:p>
+        </w:tc>
+        <w:tc>
+          <w:tcPr>
+            <w:tcW w:type="dxa" w:w="3135"/>
+          </w:tcPr>
+          <w:p>
+            <w:r/>
+            <w:r>
+              <w:rPr>
+                <w:color w:val="1A1A1A"/>
+                <w:sz w:val="20"/>
+              </w:rPr>
+              <w:t>Apply to Childhood Foundation before Dec 31 deadline</w:t>
+            </w:r>
+          </w:p>
+        </w:tc>
+        <w:tc>
+          <w:tcPr>
+            <w:tcW w:type="dxa" w:w="3135"/>
+          </w:tcPr>
+          <w:p>
+            <w:r/>
+            <w:r>
+              <w:rPr>
+                <w:color w:val="1A1A1A"/>
+                <w:sz w:val="20"/>
+              </w:rPr>
+              <w:t>Before December 2026</w:t>
+            </w:r>
+          </w:p>
+        </w:tc>
+      </w:tr>
+      <w:tr>
+        <w:tc>
+          <w:tcPr>
+            <w:tcW w:type="dxa" w:w="3135"/>
+            <w:shd w:fill="F0FDF4"/>
+          </w:tcPr>
+          <w:p>
+            <w:r/>
+            <w:r>
+              <w:rPr>
+                <w:color w:val="1A1A1A"/>
+                <w:sz w:val="20"/>
+              </w:rPr>
+              <w:t>8</w:t>
+            </w:r>
+          </w:p>
+        </w:tc>
+        <w:tc>
+          <w:tcPr>
+            <w:tcW w:type="dxa" w:w="3135"/>
+            <w:shd w:fill="F0FDF4"/>
+          </w:tcPr>
+          <w:p>
+            <w:r/>
+            <w:r>
+              <w:rPr>
+                <w:color w:val="1A1A1A"/>
+                <w:sz w:val="20"/>
+              </w:rPr>
+              <w:t>Engage Edhi/Al-Khidmat/SOS for co-branded pilot deployment</w:t>
+            </w:r>
+          </w:p>
+        </w:tc>
+        <w:tc>
+          <w:tcPr>
+            <w:tcW w:type="dxa" w:w="3135"/>
+            <w:shd w:fill="F0FDF4"/>
+          </w:tcPr>
+          <w:p>
+            <w:r/>
+            <w:r>
+              <w:rPr>
+                <w:color w:val="1A1A1A"/>
+                <w:sz w:val="20"/>
+              </w:rPr>
+              <w:t>Months 2–4</w:t>
+            </w:r>
+          </w:p>
+        </w:tc>
+      </w:tr>
+    </w:tbl>
+    <w:p>
+      <w:pPr>
+        <w:spacing w:before="160" w:after="160"/>
+        <w:ind w:left="567"/>
+      </w:pPr>
+      <w:r>
+        <w:rPr>
+          <w:i/>
+          <w:color w:val="10B981"/>
+          <w:sz w:val="24"/>
+        </w:rPr>
+        <w:t>Total addressable funding from identified sources: $100,000–$500,000+ in Year 1, with government contracts and NGO partnerships scaling beyond that.</w:t>
+      </w:r>
+    </w:p>
+    <w:p>
+      <w:r>
+        <w:br w:type="page"/>
+      </w:r>
+    </w:p>
+    <w:p>
+      <w:pPr>
+        <w:spacing w:before="480" w:after="240"/>
+      </w:pPr>
+      <w:r>
+        <w:rPr>
+          <w:b/>
+          <w:color w:val="10B981"/>
+          <w:sz w:val="44"/>
+        </w:rPr>
         <w:t>See It Live</w:t>
       </w:r>
     </w:p>
@@ -4157,6 +5430,146 @@
         <w:t>"Minority children in Pakistan face high levels of discrimination"</w:t>
       </w:r>
     </w:p>
+    <w:p>
+      <w:pPr>
+        <w:spacing w:after="40"/>
+      </w:pPr>
+      <w:r>
+        <w:rPr>
+          <w:b/>
+          <w:color w:val="5A5A5A"/>
+          <w:sz w:val="18"/>
+        </w:rPr>
+        <w:t xml:space="preserve">UNICEF Venture Fund: </w:t>
+      </w:r>
+      <w:r>
+        <w:rPr>
+          <w:color w:val="888888"/>
+          <w:sz w:val="18"/>
+        </w:rPr>
+        <w:t>unicefventurefund.org — equity-free startup funding for UNICEF programme countries</w:t>
+      </w:r>
+    </w:p>
+    <w:p>
+      <w:pPr>
+        <w:spacing w:after="40"/>
+      </w:pPr>
+      <w:r>
+        <w:rPr>
+          <w:b/>
+          <w:color w:val="5A5A5A"/>
+          <w:sz w:val="18"/>
+        </w:rPr>
+        <w:t xml:space="preserve">IGNITE Pakistan: </w:t>
+      </w:r>
+      <w:r>
+        <w:rPr>
+          <w:color w:val="888888"/>
+          <w:sz w:val="18"/>
+        </w:rPr>
+        <w:t>ignite.org.pk — National Technology Fund for social impact tech startups</w:t>
+      </w:r>
+    </w:p>
+    <w:p>
+      <w:pPr>
+        <w:spacing w:after="40"/>
+      </w:pPr>
+      <w:r>
+        <w:rPr>
+          <w:b/>
+          <w:color w:val="5A5A5A"/>
+          <w:sz w:val="18"/>
+        </w:rPr>
+        <w:t xml:space="preserve">Punjab IT Board: </w:t>
+      </w:r>
+      <w:r>
+        <w:rPr>
+          <w:color w:val="888888"/>
+          <w:sz w:val="18"/>
+        </w:rPr>
+        <w:t>pitb.gov.pk — Plan9 incubation and Punjab Innovation Park</w:t>
+      </w:r>
+    </w:p>
+    <w:p>
+      <w:pPr>
+        <w:spacing w:after="40"/>
+      </w:pPr>
+      <w:r>
+        <w:rPr>
+          <w:b/>
+          <w:color w:val="5A5A5A"/>
+          <w:sz w:val="18"/>
+        </w:rPr>
+        <w:t xml:space="preserve">UNDP Pakistan: </w:t>
+      </w:r>
+      <w:r>
+        <w:rPr>
+          <w:color w:val="888888"/>
+          <w:sz w:val="18"/>
+        </w:rPr>
+        <w:t>Innovation Challenge Fund — grants for scalable social innovations</w:t>
+      </w:r>
+    </w:p>
+    <w:p>
+      <w:pPr>
+        <w:spacing w:after="40"/>
+      </w:pPr>
+      <w:r>
+        <w:rPr>
+          <w:b/>
+          <w:color w:val="5A5A5A"/>
+          <w:sz w:val="18"/>
+        </w:rPr>
+        <w:t xml:space="preserve">EU Grants: </w:t>
+      </w:r>
+      <w:r>
+        <w:rPr>
+          <w:color w:val="888888"/>
+          <w:sz w:val="18"/>
+        </w:rPr>
+        <w:t>Integrated Child Protection Systems call — ec.europa.eu</w:t>
+      </w:r>
+    </w:p>
+    <w:p>
+      <w:pPr>
+        <w:spacing w:after="40"/>
+      </w:pPr>
+      <w:r>
+        <w:rPr>
+          <w:b/>
+          <w:color w:val="5A5A5A"/>
+          <w:sz w:val="18"/>
+        </w:rPr>
+        <w:t xml:space="preserve">fundsforNGOs: </w:t>
+      </w:r>
+      <w:r>
+        <w:rPr>
+          <w:color w:val="888888"/>
+          <w:sz w:val="18"/>
+        </w:rPr>
+        <w:t>fundsforngos.org — grant aggregator for Pakistan opportunities</w:t>
+      </w:r>
+    </w:p>
+    <w:p>
+      <w:pPr>
+        <w:spacing w:after="40"/>
+      </w:pPr>
+      <w:r>
+        <w:rPr>
+          <w:b/>
+          <w:color w:val="5A5A5A"/>
+          <w:sz w:val="18"/>
+        </w:rPr>
+        <w:t xml:space="preserve">startup.pk: </w:t>
+      </w:r>
+      <w:r>
+        <w:rPr>
+          <w:color w:val="888888"/>
+          <w:sz w:val="18"/>
+        </w:rPr>
+        <w:t>Funding Opportunities for Social Entrepreneurs in Pakistan (2025)</w:t>
+      </w:r>
+    </w:p>
     <w:sectPr>
       <w:pgSz w:w="12240" w:h="15840"/>
       <w:pgMar w:top="1134" w:right="1417" w:bottom="1134" w:left="1417" w:header="720" w:footer="720" w:gutter="0"/>

</xml_diff>

<commit_message>
Add real funding numbers to pitch document
Shows actual spend: UNICEF ($135.6M-$140.9M appeals), World Bank
($535M CRISP, $46M child health, $100M Punjab), Pakistan govt
(Rs 117B education, Rs 32.27B health), OCHA ($364M total 2024).
Over $1B flows annually — zero to AI orphanage monitoring.

Co-Authored-By: Claude Opus 4.6 <noreply@anthropic.com>
Claude-Session: https://claude.ai/code/session_01SpVHb4wYBcqMn4yr5tsTKr
</commit_message>
<xml_diff>
--- a/OrphanGuard_AI_Pitch_Document.docx
+++ b/OrphanGuard_AI_Pitch_Document.docx
@@ -3740,7 +3740,7 @@
           <w:color w:val="10B981"/>
           <w:sz w:val="44"/>
         </w:rPr>
-        <w:t>Funding &amp; Grant Opportunities</w:t>
+        <w:t>Funding &amp; Investment Landscape</w:t>
       </w:r>
     </w:p>
     <w:p>
@@ -3764,9 +3764,1281 @@
           <w:color w:val="333333"/>
           <w:sz w:val="22"/>
         </w:rPr>
-        <w:t>OrphanGuard AI sits at the intersection of AI, child protection, and social impact — a space where multiple international and domestic funders are actively deploying capital. The following opportunities are directly aligned with this project.</w:t>
+        <w:t>Billions of dollars flow into child welfare in Pakistan every year — from the UN, World Bank, foreign donors, and the Pakistani government itself. Yet almost none of it goes toward technology-driven monitoring. OrphanGuard AI sits in that gap.</w:t>
       </w:r>
     </w:p>
+    <w:p>
+      <w:pPr>
+        <w:spacing w:before="320" w:after="160"/>
+      </w:pPr>
+      <w:r>
+        <w:rPr>
+          <w:b/>
+          <w:color w:val="0A7A56"/>
+          <w:sz w:val="30"/>
+        </w:rPr>
+        <w:t>How Much Money Is Already Being Spent</w:t>
+      </w:r>
+    </w:p>
+    <w:tbl>
+      <w:tblPr>
+        <w:tblW w:type="auto" w:w="0"/>
+        <w:jc w:val="center"/>
+        <w:tblLook w:firstColumn="1" w:firstRow="1" w:lastColumn="0" w:lastRow="0" w:noHBand="0" w:noVBand="1" w:val="04A0"/>
+        <w:tblBorders>
+          <w:top w:val="single" w:sz="4" w:space="0" w:color="D1D5DB"/>
+          <w:left w:val="single" w:sz="4" w:space="0" w:color="D1D5DB"/>
+          <w:bottom w:val="single" w:sz="4" w:space="0" w:color="D1D5DB"/>
+          <w:right w:val="single" w:sz="4" w:space="0" w:color="D1D5DB"/>
+          <w:insideH w:val="single" w:sz="4" w:space="0" w:color="D1D5DB"/>
+          <w:insideV w:val="single" w:sz="4" w:space="0" w:color="D1D5DB"/>
+        </w:tblBorders>
+      </w:tblPr>
+      <w:tblGrid>
+        <w:gridCol w:w="2351"/>
+        <w:gridCol w:w="2351"/>
+        <w:gridCol w:w="2351"/>
+        <w:gridCol w:w="2351"/>
+      </w:tblGrid>
+      <w:tr>
+        <w:tc>
+          <w:tcPr>
+            <w:tcW w:type="dxa" w:w="2351"/>
+            <w:shd w:fill="10B981"/>
+          </w:tcPr>
+          <w:p>
+            <w:r/>
+            <w:r>
+              <w:rPr>
+                <w:b/>
+                <w:color w:val="FFFFFF"/>
+                <w:sz w:val="20"/>
+              </w:rPr>
+              <w:t>Who</w:t>
+            </w:r>
+          </w:p>
+        </w:tc>
+        <w:tc>
+          <w:tcPr>
+            <w:tcW w:type="dxa" w:w="2351"/>
+            <w:shd w:fill="10B981"/>
+          </w:tcPr>
+          <w:p>
+            <w:r/>
+            <w:r>
+              <w:rPr>
+                <w:b/>
+                <w:color w:val="FFFFFF"/>
+                <w:sz w:val="20"/>
+              </w:rPr>
+              <w:t>How Much</w:t>
+            </w:r>
+          </w:p>
+        </w:tc>
+        <w:tc>
+          <w:tcPr>
+            <w:tcW w:type="dxa" w:w="2351"/>
+            <w:shd w:fill="10B981"/>
+          </w:tcPr>
+          <w:p>
+            <w:r/>
+            <w:r>
+              <w:rPr>
+                <w:b/>
+                <w:color w:val="FFFFFF"/>
+                <w:sz w:val="20"/>
+              </w:rPr>
+              <w:t>What For</w:t>
+            </w:r>
+          </w:p>
+        </w:tc>
+        <w:tc>
+          <w:tcPr>
+            <w:tcW w:type="dxa" w:w="2351"/>
+            <w:shd w:fill="10B981"/>
+          </w:tcPr>
+          <w:p>
+            <w:r/>
+            <w:r>
+              <w:rPr>
+                <w:b/>
+                <w:color w:val="FFFFFF"/>
+                <w:sz w:val="20"/>
+              </w:rPr>
+              <w:t>Year</w:t>
+            </w:r>
+          </w:p>
+        </w:tc>
+      </w:tr>
+      <w:tr>
+        <w:tc>
+          <w:tcPr>
+            <w:tcW w:type="dxa" w:w="2351"/>
+          </w:tcPr>
+          <w:p>
+            <w:r/>
+            <w:r>
+              <w:rPr>
+                <w:color w:val="1A1A1A"/>
+                <w:sz w:val="20"/>
+              </w:rPr>
+              <w:t>UNICEF Pakistan</w:t>
+            </w:r>
+          </w:p>
+        </w:tc>
+        <w:tc>
+          <w:tcPr>
+            <w:tcW w:type="dxa" w:w="2351"/>
+          </w:tcPr>
+          <w:p>
+            <w:r/>
+            <w:r>
+              <w:rPr>
+                <w:color w:val="1A1A1A"/>
+                <w:sz w:val="20"/>
+              </w:rPr>
+              <w:t>$135.6 Million (appeal)</w:t>
+            </w:r>
+          </w:p>
+        </w:tc>
+        <w:tc>
+          <w:tcPr>
+            <w:tcW w:type="dxa" w:w="2351"/>
+          </w:tcPr>
+          <w:p>
+            <w:r/>
+            <w:r>
+              <w:rPr>
+                <w:color w:val="1A1A1A"/>
+                <w:sz w:val="20"/>
+              </w:rPr>
+              <w:t>Humanitarian Action for Children — health, nutrition, education, child protection</w:t>
+            </w:r>
+          </w:p>
+        </w:tc>
+        <w:tc>
+          <w:tcPr>
+            <w:tcW w:type="dxa" w:w="2351"/>
+          </w:tcPr>
+          <w:p>
+            <w:r/>
+            <w:r>
+              <w:rPr>
+                <w:color w:val="1A1A1A"/>
+                <w:sz w:val="20"/>
+              </w:rPr>
+              <w:t>2024</w:t>
+            </w:r>
+          </w:p>
+        </w:tc>
+      </w:tr>
+      <w:tr>
+        <w:tc>
+          <w:tcPr>
+            <w:tcW w:type="dxa" w:w="2351"/>
+            <w:shd w:fill="F0FDF4"/>
+          </w:tcPr>
+          <w:p>
+            <w:r/>
+            <w:r>
+              <w:rPr>
+                <w:color w:val="1A1A1A"/>
+                <w:sz w:val="20"/>
+              </w:rPr>
+              <w:t>UNICEF Pakistan</w:t>
+            </w:r>
+          </w:p>
+        </w:tc>
+        <w:tc>
+          <w:tcPr>
+            <w:tcW w:type="dxa" w:w="2351"/>
+            <w:shd w:fill="F0FDF4"/>
+          </w:tcPr>
+          <w:p>
+            <w:r/>
+            <w:r>
+              <w:rPr>
+                <w:color w:val="1A1A1A"/>
+                <w:sz w:val="20"/>
+              </w:rPr>
+              <w:t>$140.9 Million (appeal)</w:t>
+            </w:r>
+          </w:p>
+        </w:tc>
+        <w:tc>
+          <w:tcPr>
+            <w:tcW w:type="dxa" w:w="2351"/>
+            <w:shd w:fill="F0FDF4"/>
+          </w:tcPr>
+          <w:p>
+            <w:r/>
+            <w:r>
+              <w:rPr>
+                <w:color w:val="1A1A1A"/>
+                <w:sz w:val="20"/>
+              </w:rPr>
+              <w:t>Same program, increased target</w:t>
+            </w:r>
+          </w:p>
+        </w:tc>
+        <w:tc>
+          <w:tcPr>
+            <w:tcW w:type="dxa" w:w="2351"/>
+            <w:shd w:fill="F0FDF4"/>
+          </w:tcPr>
+          <w:p>
+            <w:r/>
+            <w:r>
+              <w:rPr>
+                <w:color w:val="1A1A1A"/>
+                <w:sz w:val="20"/>
+              </w:rPr>
+              <w:t>2025</w:t>
+            </w:r>
+          </w:p>
+        </w:tc>
+      </w:tr>
+      <w:tr>
+        <w:tc>
+          <w:tcPr>
+            <w:tcW w:type="dxa" w:w="2351"/>
+          </w:tcPr>
+          <w:p>
+            <w:r/>
+            <w:r>
+              <w:rPr>
+                <w:color w:val="1A1A1A"/>
+                <w:sz w:val="20"/>
+              </w:rPr>
+              <w:t>UNICEF Pakistan</w:t>
+            </w:r>
+          </w:p>
+        </w:tc>
+        <w:tc>
+          <w:tcPr>
+            <w:tcW w:type="dxa" w:w="2351"/>
+          </w:tcPr>
+          <w:p>
+            <w:r/>
+            <w:r>
+              <w:rPr>
+                <w:color w:val="1A1A1A"/>
+                <w:sz w:val="20"/>
+              </w:rPr>
+              <w:t>$37.4 Million (received)</w:t>
+            </w:r>
+          </w:p>
+        </w:tc>
+        <w:tc>
+          <w:tcPr>
+            <w:tcW w:type="dxa" w:w="2351"/>
+          </w:tcPr>
+          <w:p>
+            <w:r/>
+            <w:r>
+              <w:rPr>
+                <w:color w:val="1A1A1A"/>
+                <w:sz w:val="20"/>
+              </w:rPr>
+              <w:t>Actual funds received against 2024 appeal (28% of target)</w:t>
+            </w:r>
+          </w:p>
+        </w:tc>
+        <w:tc>
+          <w:tcPr>
+            <w:tcW w:type="dxa" w:w="2351"/>
+          </w:tcPr>
+          <w:p>
+            <w:r/>
+            <w:r>
+              <w:rPr>
+                <w:color w:val="1A1A1A"/>
+                <w:sz w:val="20"/>
+              </w:rPr>
+              <w:t>2024</w:t>
+            </w:r>
+          </w:p>
+        </w:tc>
+      </w:tr>
+      <w:tr>
+        <w:tc>
+          <w:tcPr>
+            <w:tcW w:type="dxa" w:w="2351"/>
+            <w:shd w:fill="F0FDF4"/>
+          </w:tcPr>
+          <w:p>
+            <w:r/>
+            <w:r>
+              <w:rPr>
+                <w:color w:val="1A1A1A"/>
+                <w:sz w:val="20"/>
+              </w:rPr>
+              <w:t>UNICEF Pakistan</w:t>
+            </w:r>
+          </w:p>
+        </w:tc>
+        <w:tc>
+          <w:tcPr>
+            <w:tcW w:type="dxa" w:w="2351"/>
+            <w:shd w:fill="F0FDF4"/>
+          </w:tcPr>
+          <w:p>
+            <w:r/>
+            <w:r>
+              <w:rPr>
+                <w:color w:val="1A1A1A"/>
+                <w:sz w:val="20"/>
+              </w:rPr>
+              <w:t>$173.5 Million</w:t>
+            </w:r>
+          </w:p>
+        </w:tc>
+        <w:tc>
+          <w:tcPr>
+            <w:tcW w:type="dxa" w:w="2351"/>
+            <w:shd w:fill="F0FDF4"/>
+          </w:tcPr>
+          <w:p>
+            <w:r/>
+            <w:r>
+              <w:rPr>
+                <w:color w:val="1A1A1A"/>
+                <w:sz w:val="20"/>
+              </w:rPr>
+              <w:t>Post-flood response for women and children</w:t>
+            </w:r>
+          </w:p>
+        </w:tc>
+        <w:tc>
+          <w:tcPr>
+            <w:tcW w:type="dxa" w:w="2351"/>
+            <w:shd w:fill="F0FDF4"/>
+          </w:tcPr>
+          <w:p>
+            <w:r/>
+            <w:r>
+              <w:rPr>
+                <w:color w:val="1A1A1A"/>
+                <w:sz w:val="20"/>
+              </w:rPr>
+              <w:t>2022–2023</w:t>
+            </w:r>
+          </w:p>
+        </w:tc>
+      </w:tr>
+      <w:tr>
+        <w:tc>
+          <w:tcPr>
+            <w:tcW w:type="dxa" w:w="2351"/>
+          </w:tcPr>
+          <w:p>
+            <w:r/>
+            <w:r>
+              <w:rPr>
+                <w:color w:val="1A1A1A"/>
+                <w:sz w:val="20"/>
+              </w:rPr>
+              <w:t>UNICEF Global</w:t>
+            </w:r>
+          </w:p>
+        </w:tc>
+        <w:tc>
+          <w:tcPr>
+            <w:tcW w:type="dxa" w:w="2351"/>
+          </w:tcPr>
+          <w:p>
+            <w:r/>
+            <w:r>
+              <w:rPr>
+                <w:color w:val="1A1A1A"/>
+                <w:sz w:val="20"/>
+              </w:rPr>
+              <w:t>$934 Million</w:t>
+            </w:r>
+          </w:p>
+        </w:tc>
+        <w:tc>
+          <w:tcPr>
+            <w:tcW w:type="dxa" w:w="2351"/>
+          </w:tcPr>
+          <w:p>
+            <w:r/>
+            <w:r>
+              <w:rPr>
+                <w:color w:val="1A1A1A"/>
+                <w:sz w:val="20"/>
+              </w:rPr>
+              <w:t>Total child protection expenditure worldwide</w:t>
+            </w:r>
+          </w:p>
+        </w:tc>
+        <w:tc>
+          <w:tcPr>
+            <w:tcW w:type="dxa" w:w="2351"/>
+          </w:tcPr>
+          <w:p>
+            <w:r/>
+            <w:r>
+              <w:rPr>
+                <w:color w:val="1A1A1A"/>
+                <w:sz w:val="20"/>
+              </w:rPr>
+              <w:t>2024</w:t>
+            </w:r>
+          </w:p>
+        </w:tc>
+      </w:tr>
+      <w:tr>
+        <w:tc>
+          <w:tcPr>
+            <w:tcW w:type="dxa" w:w="2351"/>
+            <w:shd w:fill="F0FDF4"/>
+          </w:tcPr>
+          <w:p>
+            <w:r/>
+            <w:r>
+              <w:rPr>
+                <w:color w:val="1A1A1A"/>
+                <w:sz w:val="20"/>
+              </w:rPr>
+              <w:t>UNICEF Venture Fund</w:t>
+            </w:r>
+          </w:p>
+        </w:tc>
+        <w:tc>
+          <w:tcPr>
+            <w:tcW w:type="dxa" w:w="2351"/>
+            <w:shd w:fill="F0FDF4"/>
+          </w:tcPr>
+          <w:p>
+            <w:r/>
+            <w:r>
+              <w:rPr>
+                <w:color w:val="1A1A1A"/>
+                <w:sz w:val="20"/>
+              </w:rPr>
+              <w:t>$35 Million (fund size)</w:t>
+            </w:r>
+          </w:p>
+        </w:tc>
+        <w:tc>
+          <w:tcPr>
+            <w:tcW w:type="dxa" w:w="2351"/>
+            <w:shd w:fill="F0FDF4"/>
+          </w:tcPr>
+          <w:p>
+            <w:r/>
+            <w:r>
+              <w:rPr>
+                <w:color w:val="1A1A1A"/>
+                <w:sz w:val="20"/>
+              </w:rPr>
+              <w:t>Invested in 153 startups across 85+ countries; portfolio raised $138M in follow-on</w:t>
+            </w:r>
+          </w:p>
+        </w:tc>
+        <w:tc>
+          <w:tcPr>
+            <w:tcW w:type="dxa" w:w="2351"/>
+            <w:shd w:fill="F0FDF4"/>
+          </w:tcPr>
+          <w:p>
+            <w:r/>
+            <w:r>
+              <w:rPr>
+                <w:color w:val="1A1A1A"/>
+                <w:sz w:val="20"/>
+              </w:rPr>
+              <w:t>Cumulative</w:t>
+            </w:r>
+          </w:p>
+        </w:tc>
+      </w:tr>
+      <w:tr>
+        <w:tc>
+          <w:tcPr>
+            <w:tcW w:type="dxa" w:w="2351"/>
+          </w:tcPr>
+          <w:p>
+            <w:r/>
+            <w:r>
+              <w:rPr>
+                <w:color w:val="1A1A1A"/>
+                <w:sz w:val="20"/>
+              </w:rPr>
+              <w:t>World Bank</w:t>
+            </w:r>
+          </w:p>
+        </w:tc>
+        <w:tc>
+          <w:tcPr>
+            <w:tcW w:type="dxa" w:w="2351"/>
+          </w:tcPr>
+          <w:p>
+            <w:r/>
+            <w:r>
+              <w:rPr>
+                <w:color w:val="1A1A1A"/>
+                <w:sz w:val="20"/>
+              </w:rPr>
+              <w:t>$535 Million</w:t>
+            </w:r>
+          </w:p>
+        </w:tc>
+        <w:tc>
+          <w:tcPr>
+            <w:tcW w:type="dxa" w:w="2351"/>
+          </w:tcPr>
+          <w:p>
+            <w:r/>
+            <w:r>
+              <w:rPr>
+                <w:color w:val="1A1A1A"/>
+                <w:sz w:val="20"/>
+              </w:rPr>
+              <w:t>Crisis-Resilient Social Protection (CRISP) for Pakistan</w:t>
+            </w:r>
+          </w:p>
+        </w:tc>
+        <w:tc>
+          <w:tcPr>
+            <w:tcW w:type="dxa" w:w="2351"/>
+          </w:tcPr>
+          <w:p>
+            <w:r/>
+            <w:r>
+              <w:rPr>
+                <w:color w:val="1A1A1A"/>
+                <w:sz w:val="20"/>
+              </w:rPr>
+              <w:t>2024</w:t>
+            </w:r>
+          </w:p>
+        </w:tc>
+      </w:tr>
+      <w:tr>
+        <w:tc>
+          <w:tcPr>
+            <w:tcW w:type="dxa" w:w="2351"/>
+            <w:shd w:fill="F0FDF4"/>
+          </w:tcPr>
+          <w:p>
+            <w:r/>
+            <w:r>
+              <w:rPr>
+                <w:color w:val="1A1A1A"/>
+                <w:sz w:val="20"/>
+              </w:rPr>
+              <w:t>World Bank</w:t>
+            </w:r>
+          </w:p>
+        </w:tc>
+        <w:tc>
+          <w:tcPr>
+            <w:tcW w:type="dxa" w:w="2351"/>
+            <w:shd w:fill="F0FDF4"/>
+          </w:tcPr>
+          <w:p>
+            <w:r/>
+            <w:r>
+              <w:rPr>
+                <w:color w:val="1A1A1A"/>
+                <w:sz w:val="20"/>
+              </w:rPr>
+              <w:t>$46 Million</w:t>
+            </w:r>
+          </w:p>
+        </w:tc>
+        <w:tc>
+          <w:tcPr>
+            <w:tcW w:type="dxa" w:w="2351"/>
+            <w:shd w:fill="F0FDF4"/>
+          </w:tcPr>
+          <w:p>
+            <w:r/>
+            <w:r>
+              <w:rPr>
+                <w:color w:val="1A1A1A"/>
+                <w:sz w:val="20"/>
+              </w:rPr>
+              <w:t>Child healthcare &amp; citizen services in KPK</w:t>
+            </w:r>
+          </w:p>
+        </w:tc>
+        <w:tc>
+          <w:tcPr>
+            <w:tcW w:type="dxa" w:w="2351"/>
+            <w:shd w:fill="F0FDF4"/>
+          </w:tcPr>
+          <w:p>
+            <w:r/>
+            <w:r>
+              <w:rPr>
+                <w:color w:val="1A1A1A"/>
+                <w:sz w:val="20"/>
+              </w:rPr>
+              <w:t>2023</w:t>
+            </w:r>
+          </w:p>
+        </w:tc>
+      </w:tr>
+      <w:tr>
+        <w:tc>
+          <w:tcPr>
+            <w:tcW w:type="dxa" w:w="2351"/>
+          </w:tcPr>
+          <w:p>
+            <w:r/>
+            <w:r>
+              <w:rPr>
+                <w:color w:val="1A1A1A"/>
+                <w:sz w:val="20"/>
+              </w:rPr>
+              <w:t>World Bank</w:t>
+            </w:r>
+          </w:p>
+        </w:tc>
+        <w:tc>
+          <w:tcPr>
+            <w:tcW w:type="dxa" w:w="2351"/>
+          </w:tcPr>
+          <w:p>
+            <w:r/>
+            <w:r>
+              <w:rPr>
+                <w:color w:val="1A1A1A"/>
+                <w:sz w:val="20"/>
+              </w:rPr>
+              <w:t>$47.9 Million</w:t>
+            </w:r>
+          </w:p>
+        </w:tc>
+        <w:tc>
+          <w:tcPr>
+            <w:tcW w:type="dxa" w:w="2351"/>
+          </w:tcPr>
+          <w:p>
+            <w:r/>
+            <w:r>
+              <w:rPr>
+                <w:color w:val="1A1A1A"/>
+                <w:sz w:val="20"/>
+              </w:rPr>
+              <w:t>Education project for 4M+ children in Punjab</w:t>
+            </w:r>
+          </w:p>
+        </w:tc>
+        <w:tc>
+          <w:tcPr>
+            <w:tcW w:type="dxa" w:w="2351"/>
+          </w:tcPr>
+          <w:p>
+            <w:r/>
+            <w:r>
+              <w:rPr>
+                <w:color w:val="1A1A1A"/>
+                <w:sz w:val="20"/>
+              </w:rPr>
+              <w:t>2025</w:t>
+            </w:r>
+          </w:p>
+        </w:tc>
+      </w:tr>
+      <w:tr>
+        <w:tc>
+          <w:tcPr>
+            <w:tcW w:type="dxa" w:w="2351"/>
+            <w:shd w:fill="F0FDF4"/>
+          </w:tcPr>
+          <w:p>
+            <w:r/>
+            <w:r>
+              <w:rPr>
+                <w:color w:val="1A1A1A"/>
+                <w:sz w:val="20"/>
+              </w:rPr>
+              <w:t>World Bank</w:t>
+            </w:r>
+          </w:p>
+        </w:tc>
+        <w:tc>
+          <w:tcPr>
+            <w:tcW w:type="dxa" w:w="2351"/>
+            <w:shd w:fill="F0FDF4"/>
+          </w:tcPr>
+          <w:p>
+            <w:r/>
+            <w:r>
+              <w:rPr>
+                <w:color w:val="1A1A1A"/>
+                <w:sz w:val="20"/>
+              </w:rPr>
+              <w:t>$100 Million</w:t>
+            </w:r>
+          </w:p>
+        </w:tc>
+        <w:tc>
+          <w:tcPr>
+            <w:tcW w:type="dxa" w:w="2351"/>
+            <w:shd w:fill="F0FDF4"/>
+          </w:tcPr>
+          <w:p>
+            <w:r/>
+            <w:r>
+              <w:rPr>
+                <w:color w:val="1A1A1A"/>
+                <w:sz w:val="20"/>
+              </w:rPr>
+              <w:t>Family planning services in Punjab</w:t>
+            </w:r>
+          </w:p>
+        </w:tc>
+        <w:tc>
+          <w:tcPr>
+            <w:tcW w:type="dxa" w:w="2351"/>
+            <w:shd w:fill="F0FDF4"/>
+          </w:tcPr>
+          <w:p>
+            <w:r/>
+            <w:r>
+              <w:rPr>
+                <w:color w:val="1A1A1A"/>
+                <w:sz w:val="20"/>
+              </w:rPr>
+              <w:t>2023</w:t>
+            </w:r>
+          </w:p>
+        </w:tc>
+      </w:tr>
+      <w:tr>
+        <w:tc>
+          <w:tcPr>
+            <w:tcW w:type="dxa" w:w="2351"/>
+          </w:tcPr>
+          <w:p>
+            <w:r/>
+            <w:r>
+              <w:rPr>
+                <w:color w:val="1A1A1A"/>
+                <w:sz w:val="20"/>
+              </w:rPr>
+              <w:t>World Bank</w:t>
+            </w:r>
+          </w:p>
+        </w:tc>
+        <w:tc>
+          <w:tcPr>
+            <w:tcW w:type="dxa" w:w="2351"/>
+          </w:tcPr>
+          <w:p>
+            <w:r/>
+            <w:r>
+              <w:rPr>
+                <w:color w:val="1A1A1A"/>
+                <w:sz w:val="20"/>
+              </w:rPr>
+              <w:t>$102 Million</w:t>
+            </w:r>
+          </w:p>
+        </w:tc>
+        <w:tc>
+          <w:tcPr>
+            <w:tcW w:type="dxa" w:w="2351"/>
+          </w:tcPr>
+          <w:p>
+            <w:r/>
+            <w:r>
+              <w:rPr>
+                <w:color w:val="1A1A1A"/>
+                <w:sz w:val="20"/>
+              </w:rPr>
+              <w:t>Financial inclusion for vulnerable populations</w:t>
+            </w:r>
+          </w:p>
+        </w:tc>
+        <w:tc>
+          <w:tcPr>
+            <w:tcW w:type="dxa" w:w="2351"/>
+          </w:tcPr>
+          <w:p>
+            <w:r/>
+            <w:r>
+              <w:rPr>
+                <w:color w:val="1A1A1A"/>
+                <w:sz w:val="20"/>
+              </w:rPr>
+              <w:t>2025</w:t>
+            </w:r>
+          </w:p>
+        </w:tc>
+      </w:tr>
+      <w:tr>
+        <w:tc>
+          <w:tcPr>
+            <w:tcW w:type="dxa" w:w="2351"/>
+            <w:shd w:fill="F0FDF4"/>
+          </w:tcPr>
+          <w:p>
+            <w:r/>
+            <w:r>
+              <w:rPr>
+                <w:color w:val="1A1A1A"/>
+                <w:sz w:val="20"/>
+              </w:rPr>
+              <w:t>Pakistan Govt (Sweet Homes)</w:t>
+            </w:r>
+          </w:p>
+        </w:tc>
+        <w:tc>
+          <w:tcPr>
+            <w:tcW w:type="dxa" w:w="2351"/>
+            <w:shd w:fill="F0FDF4"/>
+          </w:tcPr>
+          <w:p>
+            <w:r/>
+            <w:r>
+              <w:rPr>
+                <w:color w:val="1A1A1A"/>
+                <w:sz w:val="20"/>
+              </w:rPr>
+              <w:t>Rs 645.89 Million (~$2.3M)</w:t>
+            </w:r>
+          </w:p>
+        </w:tc>
+        <w:tc>
+          <w:tcPr>
+            <w:tcW w:type="dxa" w:w="2351"/>
+            <w:shd w:fill="F0FDF4"/>
+          </w:tcPr>
+          <w:p>
+            <w:r/>
+            <w:r>
+              <w:rPr>
+                <w:color w:val="1A1A1A"/>
+                <w:sz w:val="20"/>
+              </w:rPr>
+              <w:t>Orphaned children welfare initiative</w:t>
+            </w:r>
+          </w:p>
+        </w:tc>
+        <w:tc>
+          <w:tcPr>
+            <w:tcW w:type="dxa" w:w="2351"/>
+            <w:shd w:fill="F0FDF4"/>
+          </w:tcPr>
+          <w:p>
+            <w:r/>
+            <w:r>
+              <w:rPr>
+                <w:color w:val="1A1A1A"/>
+                <w:sz w:val="20"/>
+              </w:rPr>
+              <w:t>2024</w:t>
+            </w:r>
+          </w:p>
+        </w:tc>
+      </w:tr>
+      <w:tr>
+        <w:tc>
+          <w:tcPr>
+            <w:tcW w:type="dxa" w:w="2351"/>
+          </w:tcPr>
+          <w:p>
+            <w:r/>
+            <w:r>
+              <w:rPr>
+                <w:color w:val="1A1A1A"/>
+                <w:sz w:val="20"/>
+              </w:rPr>
+              <w:t>Pakistan Govt (Wazaif)</w:t>
+            </w:r>
+          </w:p>
+        </w:tc>
+        <w:tc>
+          <w:tcPr>
+            <w:tcW w:type="dxa" w:w="2351"/>
+          </w:tcPr>
+          <w:p>
+            <w:r/>
+            <w:r>
+              <w:rPr>
+                <w:color w:val="1A1A1A"/>
+                <w:sz w:val="20"/>
+              </w:rPr>
+              <w:t>Rs 117 Billion (~$420M)</w:t>
+            </w:r>
+          </w:p>
+        </w:tc>
+        <w:tc>
+          <w:tcPr>
+            <w:tcW w:type="dxa" w:w="2351"/>
+          </w:tcPr>
+          <w:p>
+            <w:r/>
+            <w:r>
+              <w:rPr>
+                <w:color w:val="1A1A1A"/>
+                <w:sz w:val="20"/>
+              </w:rPr>
+              <w:t>Conditional cash transfers for 14.8M children's education</w:t>
+            </w:r>
+          </w:p>
+        </w:tc>
+        <w:tc>
+          <w:tcPr>
+            <w:tcW w:type="dxa" w:w="2351"/>
+          </w:tcPr>
+          <w:p>
+            <w:r/>
+            <w:r>
+              <w:rPr>
+                <w:color w:val="1A1A1A"/>
+                <w:sz w:val="20"/>
+              </w:rPr>
+              <w:t>2024</w:t>
+            </w:r>
+          </w:p>
+        </w:tc>
+      </w:tr>
+      <w:tr>
+        <w:tc>
+          <w:tcPr>
+            <w:tcW w:type="dxa" w:w="2351"/>
+            <w:shd w:fill="F0FDF4"/>
+          </w:tcPr>
+          <w:p>
+            <w:r/>
+            <w:r>
+              <w:rPr>
+                <w:color w:val="1A1A1A"/>
+                <w:sz w:val="20"/>
+              </w:rPr>
+              <w:t>Pakistan Govt (Nashonuma)</w:t>
+            </w:r>
+          </w:p>
+        </w:tc>
+        <w:tc>
+          <w:tcPr>
+            <w:tcW w:type="dxa" w:w="2351"/>
+            <w:shd w:fill="F0FDF4"/>
+          </w:tcPr>
+          <w:p>
+            <w:r/>
+            <w:r>
+              <w:rPr>
+                <w:color w:val="1A1A1A"/>
+                <w:sz w:val="20"/>
+              </w:rPr>
+              <w:t>Rs 32.27 Billion (~$116M)</w:t>
+            </w:r>
+          </w:p>
+        </w:tc>
+        <w:tc>
+          <w:tcPr>
+            <w:tcW w:type="dxa" w:w="2351"/>
+            <w:shd w:fill="F0FDF4"/>
+          </w:tcPr>
+          <w:p>
+            <w:r/>
+            <w:r>
+              <w:rPr>
+                <w:color w:val="1A1A1A"/>
+                <w:sz w:val="20"/>
+              </w:rPr>
+              <w:t>Maternal and child health nutrition program</w:t>
+            </w:r>
+          </w:p>
+        </w:tc>
+        <w:tc>
+          <w:tcPr>
+            <w:tcW w:type="dxa" w:w="2351"/>
+            <w:shd w:fill="F0FDF4"/>
+          </w:tcPr>
+          <w:p>
+            <w:r/>
+            <w:r>
+              <w:rPr>
+                <w:color w:val="1A1A1A"/>
+                <w:sz w:val="20"/>
+              </w:rPr>
+              <w:t>2024</w:t>
+            </w:r>
+          </w:p>
+        </w:tc>
+      </w:tr>
+      <w:tr>
+        <w:tc>
+          <w:tcPr>
+            <w:tcW w:type="dxa" w:w="2351"/>
+          </w:tcPr>
+          <w:p>
+            <w:r/>
+            <w:r>
+              <w:rPr>
+                <w:color w:val="1A1A1A"/>
+                <w:sz w:val="20"/>
+              </w:rPr>
+              <w:t>Punjab Govt</w:t>
+            </w:r>
+          </w:p>
+        </w:tc>
+        <w:tc>
+          <w:tcPr>
+            <w:tcW w:type="dxa" w:w="2351"/>
+          </w:tcPr>
+          <w:p>
+            <w:r/>
+            <w:r>
+              <w:rPr>
+                <w:color w:val="1A1A1A"/>
+                <w:sz w:val="20"/>
+              </w:rPr>
+              <w:t>Rs 4 Billion (~$14.4M)</w:t>
+            </w:r>
+          </w:p>
+        </w:tc>
+        <w:tc>
+          <w:tcPr>
+            <w:tcW w:type="dxa" w:w="2351"/>
+          </w:tcPr>
+          <w:p>
+            <w:r/>
+            <w:r>
+              <w:rPr>
+                <w:color w:val="1A1A1A"/>
+                <w:sz w:val="20"/>
+              </w:rPr>
+              <w:t>Social welfare development budget</w:t>
+            </w:r>
+          </w:p>
+        </w:tc>
+        <w:tc>
+          <w:tcPr>
+            <w:tcW w:type="dxa" w:w="2351"/>
+          </w:tcPr>
+          <w:p>
+            <w:r/>
+            <w:r>
+              <w:rPr>
+                <w:color w:val="1A1A1A"/>
+                <w:sz w:val="20"/>
+              </w:rPr>
+              <w:t>FY 2024-25</w:t>
+            </w:r>
+          </w:p>
+        </w:tc>
+      </w:tr>
+      <w:tr>
+        <w:tc>
+          <w:tcPr>
+            <w:tcW w:type="dxa" w:w="2351"/>
+            <w:shd w:fill="F0FDF4"/>
+          </w:tcPr>
+          <w:p>
+            <w:r/>
+            <w:r>
+              <w:rPr>
+                <w:color w:val="1A1A1A"/>
+                <w:sz w:val="20"/>
+              </w:rPr>
+              <w:t>Punjab Govt</w:t>
+            </w:r>
+          </w:p>
+        </w:tc>
+        <w:tc>
+          <w:tcPr>
+            <w:tcW w:type="dxa" w:w="2351"/>
+            <w:shd w:fill="F0FDF4"/>
+          </w:tcPr>
+          <w:p>
+            <w:r/>
+            <w:r>
+              <w:rPr>
+                <w:color w:val="1A1A1A"/>
+                <w:sz w:val="20"/>
+              </w:rPr>
+              <w:t>Rs 539.1 Billion (~$1.94B)</w:t>
+            </w:r>
+          </w:p>
+        </w:tc>
+        <w:tc>
+          <w:tcPr>
+            <w:tcW w:type="dxa" w:w="2351"/>
+            <w:shd w:fill="F0FDF4"/>
+          </w:tcPr>
+          <w:p>
+            <w:r/>
+            <w:r>
+              <w:rPr>
+                <w:color w:val="1A1A1A"/>
+                <w:sz w:val="20"/>
+              </w:rPr>
+              <w:t>Health sector — largest share of Punjab budget</w:t>
+            </w:r>
+          </w:p>
+        </w:tc>
+        <w:tc>
+          <w:tcPr>
+            <w:tcW w:type="dxa" w:w="2351"/>
+            <w:shd w:fill="F0FDF4"/>
+          </w:tcPr>
+          <w:p>
+            <w:r/>
+            <w:r>
+              <w:rPr>
+                <w:color w:val="1A1A1A"/>
+                <w:sz w:val="20"/>
+              </w:rPr>
+              <w:t>FY 2024-25</w:t>
+            </w:r>
+          </w:p>
+        </w:tc>
+      </w:tr>
+      <w:tr>
+        <w:tc>
+          <w:tcPr>
+            <w:tcW w:type="dxa" w:w="2351"/>
+          </w:tcPr>
+          <w:p>
+            <w:r/>
+            <w:r>
+              <w:rPr>
+                <w:color w:val="1A1A1A"/>
+                <w:sz w:val="20"/>
+              </w:rPr>
+              <w:t>Punjab Govt</w:t>
+            </w:r>
+          </w:p>
+        </w:tc>
+        <w:tc>
+          <w:tcPr>
+            <w:tcW w:type="dxa" w:w="2351"/>
+          </w:tcPr>
+          <w:p>
+            <w:r/>
+            <w:r>
+              <w:rPr>
+                <w:color w:val="1A1A1A"/>
+                <w:sz w:val="20"/>
+              </w:rPr>
+              <w:t>Rs 842 Billion (~$3B)</w:t>
+            </w:r>
+          </w:p>
+        </w:tc>
+        <w:tc>
+          <w:tcPr>
+            <w:tcW w:type="dxa" w:w="2351"/>
+          </w:tcPr>
+          <w:p>
+            <w:r/>
+            <w:r>
+              <w:rPr>
+                <w:color w:val="1A1A1A"/>
+                <w:sz w:val="20"/>
+              </w:rPr>
+              <w:t>Total development plan</w:t>
+            </w:r>
+          </w:p>
+        </w:tc>
+        <w:tc>
+          <w:tcPr>
+            <w:tcW w:type="dxa" w:w="2351"/>
+          </w:tcPr>
+          <w:p>
+            <w:r/>
+            <w:r>
+              <w:rPr>
+                <w:color w:val="1A1A1A"/>
+                <w:sz w:val="20"/>
+              </w:rPr>
+              <w:t>FY 2024-25</w:t>
+            </w:r>
+          </w:p>
+        </w:tc>
+      </w:tr>
+      <w:tr>
+        <w:tc>
+          <w:tcPr>
+            <w:tcW w:type="dxa" w:w="2351"/>
+            <w:shd w:fill="F0FDF4"/>
+          </w:tcPr>
+          <w:p>
+            <w:r/>
+            <w:r>
+              <w:rPr>
+                <w:color w:val="1A1A1A"/>
+                <w:sz w:val="20"/>
+              </w:rPr>
+              <w:t>OCHA (all donors)</w:t>
+            </w:r>
+          </w:p>
+        </w:tc>
+        <w:tc>
+          <w:tcPr>
+            <w:tcW w:type="dxa" w:w="2351"/>
+            <w:shd w:fill="F0FDF4"/>
+          </w:tcPr>
+          <w:p>
+            <w:r/>
+            <w:r>
+              <w:rPr>
+                <w:color w:val="1A1A1A"/>
+                <w:sz w:val="20"/>
+              </w:rPr>
+              <w:t>$364 Million</w:t>
+            </w:r>
+          </w:p>
+        </w:tc>
+        <w:tc>
+          <w:tcPr>
+            <w:tcW w:type="dxa" w:w="2351"/>
+            <w:shd w:fill="F0FDF4"/>
+          </w:tcPr>
+          <w:p>
+            <w:r/>
+            <w:r>
+              <w:rPr>
+                <w:color w:val="1A1A1A"/>
+                <w:sz w:val="20"/>
+              </w:rPr>
+              <w:t>Total humanitarian funding reported for Pakistan</w:t>
+            </w:r>
+          </w:p>
+        </w:tc>
+        <w:tc>
+          <w:tcPr>
+            <w:tcW w:type="dxa" w:w="2351"/>
+            <w:shd w:fill="F0FDF4"/>
+          </w:tcPr>
+          <w:p>
+            <w:r/>
+            <w:r>
+              <w:rPr>
+                <w:color w:val="1A1A1A"/>
+                <w:sz w:val="20"/>
+              </w:rPr>
+              <w:t>2024</w:t>
+            </w:r>
+          </w:p>
+        </w:tc>
+      </w:tr>
+    </w:tbl>
+    <w:p/>
+    <w:p>
+      <w:pPr>
+        <w:spacing w:before="160" w:after="160"/>
+        <w:ind w:left="567"/>
+      </w:pPr>
+      <w:r>
+        <w:rPr>
+          <w:i/>
+          <w:color w:val="10B981"/>
+          <w:sz w:val="24"/>
+        </w:rPr>
+        <w:t>Over $1 BILLION flows into child welfare in Pakistan annually. Zero goes to AI-powered orphanage monitoring. That's the opportunity.</w:t>
+      </w:r>
+    </w:p>
+    <w:p/>
     <w:p>
       <w:pPr>
         <w:spacing w:before="320" w:after="160"/>
@@ -5447,7 +6719,127 @@
           <w:color w:val="888888"/>
           <w:sz w:val="18"/>
         </w:rPr>
-        <w:t>unicefventurefund.org — equity-free startup funding for UNICEF programme countries</w:t>
+        <w:t>unicefventurefund.org — $35M fund, 153 investments, $138M follow-on raised</w:t>
+      </w:r>
+    </w:p>
+    <w:p>
+      <w:pPr>
+        <w:spacing w:after="40"/>
+      </w:pPr>
+      <w:r>
+        <w:rPr>
+          <w:b/>
+          <w:color w:val="5A5A5A"/>
+          <w:sz w:val="18"/>
+        </w:rPr>
+        <w:t xml:space="preserve">UNICEF HAC 2024: </w:t>
+      </w:r>
+      <w:r>
+        <w:rPr>
+          <w:color w:val="888888"/>
+          <w:sz w:val="18"/>
+        </w:rPr>
+        <w:t>unicef.org/appeals/pakistan — $135.6M appeal, $37.4M received</w:t>
+      </w:r>
+    </w:p>
+    <w:p>
+      <w:pPr>
+        <w:spacing w:after="40"/>
+      </w:pPr>
+      <w:r>
+        <w:rPr>
+          <w:b/>
+          <w:color w:val="5A5A5A"/>
+          <w:sz w:val="18"/>
+        </w:rPr>
+        <w:t xml:space="preserve">UNICEF HAC 2025: </w:t>
+      </w:r>
+      <w:r>
+        <w:rPr>
+          <w:color w:val="888888"/>
+          <w:sz w:val="18"/>
+        </w:rPr>
+        <w:t>unicef.org/appeals/pakistan — $140.9M appeal</w:t>
+      </w:r>
+    </w:p>
+    <w:p>
+      <w:pPr>
+        <w:spacing w:after="40"/>
+      </w:pPr>
+      <w:r>
+        <w:rPr>
+          <w:b/>
+          <w:color w:val="5A5A5A"/>
+          <w:sz w:val="18"/>
+        </w:rPr>
+        <w:t xml:space="preserve">UNICEF Global: </w:t>
+      </w:r>
+      <w:r>
+        <w:rPr>
+          <w:color w:val="888888"/>
+          <w:sz w:val="18"/>
+        </w:rPr>
+        <w:t>unicef.org/reports — $934M global child protection expenditure (2024)</w:t>
+      </w:r>
+    </w:p>
+    <w:p>
+      <w:pPr>
+        <w:spacing w:after="40"/>
+      </w:pPr>
+      <w:r>
+        <w:rPr>
+          <w:b/>
+          <w:color w:val="5A5A5A"/>
+          <w:sz w:val="18"/>
+        </w:rPr>
+        <w:t xml:space="preserve">World Bank Pakistan: </w:t>
+      </w:r>
+      <w:r>
+        <w:rPr>
+          <w:color w:val="888888"/>
+          <w:sz w:val="18"/>
+        </w:rPr>
+        <w:t>worldbank.org — CRISP $535M, KPK child health $46M, Punjab education $47.9M</w:t>
+      </w:r>
+    </w:p>
+    <w:p>
+      <w:pPr>
+        <w:spacing w:after="40"/>
+      </w:pPr>
+      <w:r>
+        <w:rPr>
+          <w:b/>
+          <w:color w:val="5A5A5A"/>
+          <w:sz w:val="18"/>
+        </w:rPr>
+        <w:t xml:space="preserve">OCHA FTS: </w:t>
+      </w:r>
+      <w:r>
+        <w:rPr>
+          <w:color w:val="888888"/>
+          <w:sz w:val="18"/>
+        </w:rPr>
+        <w:t>fts.unocha.org — $364M total humanitarian funding for Pakistan (2024)</w:t>
+      </w:r>
+    </w:p>
+    <w:p>
+      <w:pPr>
+        <w:spacing w:after="40"/>
+      </w:pPr>
+      <w:r>
+        <w:rPr>
+          <w:b/>
+          <w:color w:val="5A5A5A"/>
+          <w:sz w:val="18"/>
+        </w:rPr>
+        <w:t xml:space="preserve">Punjab Budget: </w:t>
+      </w:r>
+      <w:r>
+        <w:rPr>
+          <w:color w:val="888888"/>
+          <w:sz w:val="18"/>
+        </w:rPr>
+        <w:t>Dawn News — Rs 842B development plan, Rs 4B social welfare (FY 2024-25)</w:t>
       </w:r>
     </w:p>
     <w:p>
@@ -5548,26 +6940,6 @@
           <w:sz w:val="18"/>
         </w:rPr>
         <w:t>fundsforngos.org — grant aggregator for Pakistan opportunities</w:t>
-      </w:r>
-    </w:p>
-    <w:p>
-      <w:pPr>
-        <w:spacing w:after="40"/>
-      </w:pPr>
-      <w:r>
-        <w:rPr>
-          <w:b/>
-          <w:color w:val="5A5A5A"/>
-          <w:sz w:val="18"/>
-        </w:rPr>
-        <w:t xml:space="preserve">startup.pk: </w:t>
-      </w:r>
-      <w:r>
-        <w:rPr>
-          <w:color w:val="888888"/>
-          <w:sz w:val="18"/>
-        </w:rPr>
-        <w:t>Funding Opportunities for Social Entrepreneurs in Pakistan (2025)</w:t>
       </w:r>
     </w:p>
     <w:sectPr>

</xml_diff>